<commit_message>
added lorebooks. more ui updates
</commit_message>
<xml_diff>
--- a/World Lore.docx
+++ b/World Lore.docx
@@ -12,20 +12,87 @@
     </w:p>
     <w:p/>
     <w:p>
-      <w:r>
-        <w:rPr>
-          <w:rFonts w:hint="eastAsia"/>
+      <w:pPr>
+        <w:rPr>
+          <w:rFonts w:hint="eastAsia"/>
+          <w:b/>
+          <w:bCs/>
+        </w:rPr>
+      </w:pPr>
+      <w:r>
+        <w:rPr>
+          <w:rFonts w:hint="eastAsia"/>
+          <w:b/>
+          <w:bCs/>
         </w:rPr>
         <w:t xml:space="preserve">Alden, Yvaine, Eamon </w:t>
       </w:r>
       <w:r>
+        <w:rPr>
+          <w:b/>
+          <w:bCs/>
+        </w:rPr>
         <w:t>–</w:t>
       </w:r>
       <w:r>
         <w:rPr>
           <w:rFonts w:hint="eastAsia"/>
+          <w:b/>
+          <w:bCs/>
         </w:rPr>
         <w:t xml:space="preserve"> story 1</w:t>
+      </w:r>
+      <w:r>
+        <w:rPr>
+          <w:rFonts w:hint="eastAsia"/>
+          <w:b/>
+          <w:bCs/>
+        </w:rPr>
+        <w:t xml:space="preserve"> </w:t>
+      </w:r>
+      <w:r>
+        <w:rPr>
+          <w:b/>
+          <w:bCs/>
+        </w:rPr>
+        <w:t>–</w:t>
+      </w:r>
+      <w:r>
+        <w:rPr>
+          <w:rFonts w:hint="eastAsia"/>
+          <w:b/>
+          <w:bCs/>
+        </w:rPr>
+        <w:t xml:space="preserve"> </w:t>
+      </w:r>
+      <w:r>
+        <w:rPr>
+          <w:b/>
+          <w:bCs/>
+        </w:rPr>
+        <w:t>‘</w:t>
+      </w:r>
+      <w:r>
+        <w:rPr>
+          <w:b/>
+          <w:bCs/>
+        </w:rPr>
+        <w:t>Sixty Percent of a Hero</w:t>
+      </w:r>
+      <w:r>
+        <w:rPr>
+          <w:b/>
+          <w:bCs/>
+        </w:rPr>
+        <w:t>’</w:t>
+      </w:r>
+      <w:r>
+        <w:rPr>
+          <w:rFonts w:hint="eastAsia"/>
+          <w:b/>
+          <w:bCs/>
+        </w:rPr>
+        <w:t>, east border of Silver gale</w:t>
       </w:r>
     </w:p>
     <w:p>
@@ -100,21 +167,73 @@
     <w:p/>
     <w:p/>
     <w:p>
-      <w:r>
-        <w:rPr>
-          <w:rFonts w:hint="eastAsia"/>
+      <w:pPr>
+        <w:rPr>
+          <w:rFonts w:hint="eastAsia"/>
+          <w:b/>
+          <w:bCs/>
+        </w:rPr>
+      </w:pPr>
+      <w:r>
+        <w:rPr>
+          <w:rFonts w:hint="eastAsia"/>
+          <w:b/>
+          <w:bCs/>
         </w:rPr>
         <w:t xml:space="preserve">Lysandra, Kaelan </w:t>
       </w:r>
       <w:r>
+        <w:rPr>
+          <w:b/>
+          <w:bCs/>
+        </w:rPr>
         <w:t>–</w:t>
       </w:r>
       <w:r>
         <w:rPr>
           <w:rFonts w:hint="eastAsia"/>
+          <w:b/>
+          <w:bCs/>
         </w:rPr>
         <w:t xml:space="preserve"> story 2</w:t>
       </w:r>
+      <w:r>
+        <w:rPr>
+          <w:rFonts w:hint="eastAsia"/>
+          <w:b/>
+          <w:bCs/>
+        </w:rPr>
+        <w:t xml:space="preserve"> - </w:t>
+      </w:r>
+      <w:r>
+        <w:rPr>
+          <w:b/>
+          <w:bCs/>
+        </w:rPr>
+        <w:t>‘</w:t>
+      </w:r>
+      <w:r>
+        <w:rPr>
+          <w:b/>
+          <w:bCs/>
+        </w:rPr>
+        <w:t>A Lesson in the Dark</w:t>
+      </w:r>
+      <w:r>
+        <w:rPr>
+          <w:b/>
+          <w:bCs/>
+        </w:rPr>
+        <w:t>’</w:t>
+      </w:r>
+      <w:r>
+        <w:rPr>
+          <w:rFonts w:hint="eastAsia"/>
+          <w:b/>
+          <w:bCs/>
+        </w:rPr>
+        <w:t>, dark forest (between silver gale and woodlands)</w:t>
+      </w:r>
     </w:p>
     <w:p/>
     <w:p>
@@ -137,11 +256,11 @@
     <w:p/>
     <w:p>
       <w:r>
-        <w:t xml:space="preserve">The harsh words hung in the quiet cabin, heavy and suffocating. Lysandra, whose solitary existence had left her tragically ill-equipped for the chaotic emotional outbursts of a growing child, simply froze. Her hands rested motionless over her mortar, her lips slightly parted in a silent, stunned inadequacy. She didn't know how to reach out, how </w:t>
+        <w:t xml:space="preserve">The harsh words hung in the quiet cabin, heavy and suffocating. Lysandra, whose solitary existence had left her tragically ill-equipped for the chaotic emotional outbursts of a growing child, simply froze. Her hands rested motionless over her mortar, her lips </w:t>
       </w:r>
       <w:r>
         <w:lastRenderedPageBreak/>
-        <w:t>to bridge the gap her long isolation had built. Taking advantage of the paralyzing silence, Kaelan spun on her heel and bolted out the heavy oak door, sprinting blindly into the sprawling green labyrinth.</w:t>
+        <w:t>slightly parted in a silent, stunned inadequacy. She didn't know how to reach out, how to bridge the gap her long isolation had built. Taking advantage of the paralyzing silence, Kaelan spun on her heel and bolted out the heavy oak door, sprinting blindly into the sprawling green labyrinth.</w:t>
       </w:r>
     </w:p>
     <w:p/>
@@ -194,23 +313,97 @@
     <w:p/>
     <w:p/>
     <w:p>
-      <w:r>
-        <w:rPr>
-          <w:rFonts w:hint="eastAsia"/>
+      <w:pPr>
+        <w:rPr>
+          <w:rFonts w:hint="eastAsia"/>
+          <w:b/>
+          <w:bCs/>
+        </w:rPr>
+      </w:pPr>
+      <w:r>
+        <w:rPr>
+          <w:rFonts w:hint="eastAsia"/>
+          <w:b/>
+          <w:bCs/>
         </w:rPr>
         <w:t xml:space="preserve">Corvus, Aurora, Serilla </w:t>
       </w:r>
       <w:r>
+        <w:rPr>
+          <w:b/>
+          <w:bCs/>
+        </w:rPr>
         <w:t>–</w:t>
       </w:r>
       <w:r>
         <w:rPr>
           <w:rFonts w:hint="eastAsia"/>
+          <w:b/>
+          <w:bCs/>
         </w:rPr>
         <w:t xml:space="preserve"> story 3</w:t>
       </w:r>
-    </w:p>
-    <w:p/>
+      <w:r>
+        <w:rPr>
+          <w:rFonts w:hint="eastAsia"/>
+          <w:b/>
+          <w:bCs/>
+        </w:rPr>
+        <w:t xml:space="preserve"> </w:t>
+      </w:r>
+      <w:r>
+        <w:rPr>
+          <w:b/>
+          <w:bCs/>
+        </w:rPr>
+        <w:t>–</w:t>
+      </w:r>
+      <w:r>
+        <w:rPr>
+          <w:rFonts w:hint="eastAsia"/>
+          <w:b/>
+          <w:bCs/>
+        </w:rPr>
+        <w:t xml:space="preserve"> </w:t>
+      </w:r>
+      <w:r>
+        <w:rPr>
+          <w:b/>
+          <w:bCs/>
+        </w:rPr>
+        <w:t>‘</w:t>
+      </w:r>
+      <w:r>
+        <w:rPr>
+          <w:b/>
+          <w:bCs/>
+        </w:rPr>
+        <w:t>The Silence of the Hollow Blade</w:t>
+      </w:r>
+      <w:r>
+        <w:rPr>
+          <w:b/>
+          <w:bCs/>
+        </w:rPr>
+        <w:t>’</w:t>
+      </w:r>
+      <w:r>
+        <w:rPr>
+          <w:rFonts w:hint="eastAsia"/>
+          <w:b/>
+          <w:bCs/>
+        </w:rPr>
+        <w:t>, dark glade</w:t>
+      </w:r>
+    </w:p>
+    <w:p>
+      <w:pPr>
+        <w:rPr>
+          <w:rFonts w:hint="cs"/>
+          <w:rtl/>
+        </w:rPr>
+      </w:pPr>
+    </w:p>
     <w:p>
       <w:r>
         <w:t>The Dark Glade was less a forest and more a festering wound on the continent. The air was thick with a putrid, sulfurous rot that clung to the back of the throat, while the sprawling undergrowth bristled with poisonous, barbed fauna that blistered armor and flesh alike. It was a suffocating, lightless nightmare teeming with deadly, mutated lifeforms and an overwhelming concentration of high-tier monsters. Pushing through this hostile labyrinth on orders from the Moonlight Scripture, twenty-year-old Corvus Grim kept his holy scythe drawn. His calm, calculated demeanor masked an urgent desperation to find their targeted artifact and escape the territory as swiftly as possible.</w:t>
@@ -267,20 +460,87 @@
     </w:p>
     <w:p/>
     <w:p>
-      <w:r>
-        <w:rPr>
-          <w:rFonts w:hint="eastAsia"/>
+      <w:pPr>
+        <w:rPr>
+          <w:rFonts w:hint="eastAsia"/>
+          <w:b/>
+          <w:bCs/>
+        </w:rPr>
+      </w:pPr>
+      <w:r>
+        <w:rPr>
+          <w:rFonts w:hint="eastAsia"/>
+          <w:b/>
+          <w:bCs/>
         </w:rPr>
         <w:t xml:space="preserve">Seraphina, Fenric </w:t>
       </w:r>
       <w:r>
+        <w:rPr>
+          <w:b/>
+          <w:bCs/>
+        </w:rPr>
         <w:t>–</w:t>
       </w:r>
       <w:r>
         <w:rPr>
           <w:rFonts w:hint="eastAsia"/>
+          <w:b/>
+          <w:bCs/>
         </w:rPr>
         <w:t xml:space="preserve"> Story 4</w:t>
+      </w:r>
+      <w:r>
+        <w:rPr>
+          <w:rFonts w:hint="eastAsia"/>
+          <w:b/>
+          <w:bCs/>
+        </w:rPr>
+        <w:t xml:space="preserve"> </w:t>
+      </w:r>
+      <w:r>
+        <w:rPr>
+          <w:b/>
+          <w:bCs/>
+        </w:rPr>
+        <w:t>–</w:t>
+      </w:r>
+      <w:r>
+        <w:rPr>
+          <w:rFonts w:hint="eastAsia"/>
+          <w:b/>
+          <w:bCs/>
+        </w:rPr>
+        <w:t xml:space="preserve"> </w:t>
+      </w:r>
+      <w:r>
+        <w:rPr>
+          <w:b/>
+          <w:bCs/>
+        </w:rPr>
+        <w:t>‘</w:t>
+      </w:r>
+      <w:r>
+        <w:rPr>
+          <w:b/>
+          <w:bCs/>
+        </w:rPr>
+        <w:t>The Faithless Shield</w:t>
+      </w:r>
+      <w:r>
+        <w:rPr>
+          <w:b/>
+          <w:bCs/>
+        </w:rPr>
+        <w:t>’</w:t>
+      </w:r>
+      <w:r>
+        <w:rPr>
+          <w:rFonts w:hint="eastAsia"/>
+          <w:b/>
+          <w:bCs/>
+        </w:rPr>
+        <w:t>, Lightspear</w:t>
       </w:r>
     </w:p>
     <w:p>
@@ -328,13 +588,160 @@
         <w:t>A fleeting sorrow crossed Seraphina’s pale features. She softly declined his personal servitude, claiming she was a mere mortal vessel unworthy of such singular devotion, but gently added that the House of the Sun would gladly welcome a warrior of his caliber into its ranks. Fenric’s heart soared. It was a formal compromise, but it was enough. By taking command of her guard, he could ensure he remained a permanent fixture in her shrinking world, serving as her faithless shield against the encroaching dark. The hardened mercenary lacked the holy vocabulary of the cathedral, and he certainly lacked the words to define the desperate, anchoring emotion taking root in his chest—a pure, unspoken devotion that the rest of the world simply called love.</w:t>
       </w:r>
     </w:p>
+    <w:p/>
     <w:p>
       <w:pPr>
         <w:rPr>
           <w:rFonts w:hint="eastAsia"/>
+          <w:b/>
+          <w:bCs/>
         </w:rPr>
       </w:pPr>
-    </w:p>
+      <w:r>
+        <w:rPr>
+          <w:rFonts w:hint="eastAsia"/>
+          <w:b/>
+          <w:bCs/>
+        </w:rPr>
+        <w:t xml:space="preserve">Eva, Elowen and Evander </w:t>
+      </w:r>
+      <w:r>
+        <w:rPr>
+          <w:b/>
+          <w:bCs/>
+        </w:rPr>
+        <w:t>–</w:t>
+      </w:r>
+      <w:r>
+        <w:rPr>
+          <w:rFonts w:hint="eastAsia"/>
+          <w:b/>
+          <w:bCs/>
+        </w:rPr>
+        <w:t xml:space="preserve"> story 5</w:t>
+      </w:r>
+      <w:r>
+        <w:rPr>
+          <w:rFonts w:hint="eastAsia"/>
+          <w:b/>
+          <w:bCs/>
+        </w:rPr>
+        <w:t xml:space="preserve"> </w:t>
+      </w:r>
+      <w:r>
+        <w:rPr>
+          <w:b/>
+          <w:bCs/>
+        </w:rPr>
+        <w:t>–</w:t>
+      </w:r>
+      <w:r>
+        <w:rPr>
+          <w:rFonts w:hint="eastAsia"/>
+          <w:b/>
+          <w:bCs/>
+        </w:rPr>
+        <w:t xml:space="preserve"> </w:t>
+      </w:r>
+      <w:r>
+        <w:rPr>
+          <w:b/>
+          <w:bCs/>
+        </w:rPr>
+        <w:t>‘</w:t>
+      </w:r>
+      <w:r>
+        <w:rPr>
+          <w:b/>
+          <w:bCs/>
+        </w:rPr>
+        <w:t>The Beastmaster's Detour</w:t>
+      </w:r>
+      <w:r>
+        <w:rPr>
+          <w:b/>
+          <w:bCs/>
+        </w:rPr>
+        <w:t>’</w:t>
+      </w:r>
+      <w:r>
+        <w:rPr>
+          <w:rFonts w:hint="eastAsia"/>
+          <w:b/>
+          <w:bCs/>
+        </w:rPr>
+        <w:t>, dark forest (between silver gale and woodlands)</w:t>
+      </w:r>
+    </w:p>
+    <w:p/>
+    <w:p>
+      <w:pPr>
+        <w:rPr>
+          <w:lang w:val="en-IL"/>
+        </w:rPr>
+      </w:pPr>
+      <w:r>
+        <w:rPr>
+          <w:lang w:val="en-IL"/>
+        </w:rPr>
+        <w:t>Eva never stepped foot outside the citadel gates alone. Her traveling companions were usually hairy, four-legged, and prone to drooling, but they were the best company a scout could ask for. Accompanied by her massive black direwolf, Lycaon, the twenty-eight-year-old Beast Tamer would make the grueling, week-long trek to the abandoned ruins at the edge of the dark forest. From there, her true work began. Despite the terrifying abundance of high-tier monsters lurking in the shadows, Eva navigated the deadly, suffocating territory with remarkable ease, guided by her unique connection to the wildlife. Lately, however, her dangerous expeditions always included a deliberate detour to a rotting, abandoned shack hidden in the northern depths of the woods.</w:t>
+      </w:r>
+    </w:p>
+    <w:p>
+      <w:pPr>
+        <w:rPr>
+          <w:lang w:val="en-IL"/>
+        </w:rPr>
+      </w:pPr>
+      <w:r>
+        <w:rPr>
+          <w:lang w:val="en-IL"/>
+        </w:rPr>
+        <w:t>Inside that shack lived two exiled lycanthropes. Seventeen-year-old Elowen possessed an innate ability to detect hidden malice from leagues away, and from the very first moment she caught the human's scent, she knew Eva harbored absolutely no ill intent. Seeing the immense distances the Beast Tamer would travel just to visit them, Elowen trusted her wholeheartedly. Today, however, the atmosphere in the shack was tense. "Today we set out deeper than ever before. Our contact will be an elven druid," Evander announced, his seasoned voice carrying a heavy, hidden weight. Elven druids rarely left the safety of the eastern Woodlands, meaning the intelligence Eva carried this time was critical to the war against the rising demon king.</w:t>
+      </w:r>
+    </w:p>
+    <w:p>
+      <w:pPr>
+        <w:rPr>
+          <w:lang w:val="en-IL"/>
+        </w:rPr>
+      </w:pPr>
+      <w:r>
+        <w:rPr>
+          <w:lang w:val="en-IL"/>
+        </w:rPr>
+        <w:t xml:space="preserve">For the sixty-three-year-old lycanthrope warrior, this rendezvous was a desperate, golden opportunity. Evander secretly planned to hand his cursed daughter over to the elves' care, hoping their druidic masters could teach her to control her volatile transformations. He knew he had no place in their realm; the beastfolk sharing the woodlands would hunt him on sight for his pureblood lycanthrope nature. But Elowen, if she could weaponize her terrible curse, could become a highly valuable asset to the </w:t>
+      </w:r>
+      <w:r>
+        <w:rPr>
+          <w:lang w:val="en-IL"/>
+        </w:rPr>
+        <w:lastRenderedPageBreak/>
+        <w:t>world. Ignorant to her father's silent farewell, Elowen turned and beamed at their human ally. "Thank you for coming to pick us up every time, Ms. Eva."</w:t>
+      </w:r>
+    </w:p>
+    <w:p>
+      <w:pPr>
+        <w:rPr>
+          <w:lang w:val="en-IL"/>
+        </w:rPr>
+      </w:pPr>
+      <w:r>
+        <w:rPr>
+          <w:lang w:val="en-IL"/>
+        </w:rPr>
+        <w:t>Eva chuckled warmly, giving Lycaon a fond scratch behind the ears. "Drop the honorifics, you silly girl. We're friends, right?" Ever since their first fateful encounter months ago, Eva had frequented the dark forest far more than her missions required, genuinely cherishing the young exile's company just as much as her duty to the alliance. As the trio—flanked by the towering direwolf—began their long, perilous march toward the eastern border, Elowen stepped brightly between her father and her human friend. "Having Eva and Dad at my side... I feel like I can do anything!" the young Earth Scout declared cheerfully, walking with a soft smile into the forest, completely unaware of the heartbreaking sacrifice her father was preparing to make.</w:t>
+      </w:r>
+    </w:p>
+    <w:p>
+      <w:pPr>
+        <w:rPr>
+          <w:rFonts w:hint="eastAsia"/>
+          <w:lang w:val="en-IL"/>
+        </w:rPr>
+      </w:pPr>
+    </w:p>
+    <w:p/>
     <w:sectPr>
       <w:pgSz w:w="11906" w:h="16838"/>
       <w:pgMar w:top="1440" w:right="1440" w:bottom="1440" w:left="1440" w:header="720" w:footer="720" w:gutter="0"/>
@@ -343,6 +750,56 @@
     </w:sectPr>
   </w:body>
 </w:document>
+</file>
+
+<file path=word/endnotes.xml><?xml version="1.0" encoding="utf-8"?>
+<w:endnotes xmlns:wpc="http://schemas.microsoft.com/office/word/2010/wordprocessingCanvas" xmlns:cx="http://schemas.microsoft.com/office/drawing/2014/chartex" xmlns:cx1="http://schemas.microsoft.com/office/drawing/2015/9/8/chartex" xmlns:cx2="http://schemas.microsoft.com/office/drawing/2015/10/21/chartex" xmlns:cx3="http://schemas.microsoft.com/office/drawing/2016/5/9/chartex" xmlns:cx4="http://schemas.microsoft.com/office/drawing/2016/5/10/chartex" xmlns:cx5="http://schemas.microsoft.com/office/drawing/2016/5/11/chartex" xmlns:cx6="http://schemas.microsoft.com/office/drawing/2016/5/12/chartex" xmlns:cx7="http://schemas.microsoft.com/office/drawing/2016/5/13/chartex" xmlns:cx8="http://schemas.microsoft.com/office/drawing/2016/5/14/chartex" xmlns:mc="http://schemas.openxmlformats.org/markup-compatibility/2006" xmlns:aink="http://schemas.microsoft.com/office/drawing/2016/ink" xmlns:am3d="http://schemas.microsoft.com/office/drawing/2017/model3d" xmlns:o="urn:schemas-microsoft-com:office:office" xmlns:oel="http://schemas.microsoft.com/office/2019/extlst" xmlns:r="http://schemas.openxmlformats.org/officeDocument/2006/relationships" xmlns:m="http://schemas.openxmlformats.org/officeDocument/2006/math" xmlns:v="urn:schemas-microsoft-com:vml" xmlns:wp14="http://schemas.microsoft.com/office/word/2010/wordprocessingDrawing" xmlns:wp="http://schemas.openxmlformats.org/drawingml/2006/wordprocessingDrawing" xmlns:w10="urn:schemas-microsoft-com:office:word" xmlns:w="http://schemas.openxmlformats.org/wordprocessingml/2006/main" xmlns:w14="http://schemas.microsoft.com/office/word/2010/wordml" xmlns:w15="http://schemas.microsoft.com/office/word/2012/wordml" xmlns:w16cex="http://schemas.microsoft.com/office/word/2018/wordml/cex" xmlns:w16cid="http://schemas.microsoft.com/office/word/2016/wordml/cid" xmlns:w16="http://schemas.microsoft.com/office/word/2018/wordml" xmlns:w16du="http://schemas.microsoft.com/office/word/2023/wordml/word16du" xmlns:w16sdtdh="http://schemas.microsoft.com/office/word/2020/wordml/sdtdatahash" xmlns:w16sdtfl="http://schemas.microsoft.com/office/word/2024/wordml/sdtformatlock" xmlns:w16se="http://schemas.microsoft.com/office/word/2015/wordml/symex" xmlns:wpg="http://schemas.microsoft.com/office/word/2010/wordprocessingGroup" xmlns:wpi="http://schemas.microsoft.com/office/word/2010/wordprocessingInk" xmlns:wne="http://schemas.microsoft.com/office/word/2006/wordml" xmlns:wps="http://schemas.microsoft.com/office/word/2010/wordprocessingShape" mc:Ignorable="w14 w15 w16se w16cid w16 w16cex w16sdtdh w16sdtfl w16du wp14">
+  <w:endnote w:type="separator" w:id="-1">
+    <w:p>
+      <w:pPr>
+        <w:spacing w:after="0" w:line="240" w:lineRule="auto"/>
+      </w:pPr>
+      <w:r>
+        <w:separator/>
+      </w:r>
+    </w:p>
+  </w:endnote>
+  <w:endnote w:type="continuationSeparator" w:id="0">
+    <w:p>
+      <w:pPr>
+        <w:spacing w:after="0" w:line="240" w:lineRule="auto"/>
+      </w:pPr>
+      <w:r>
+        <w:continuationSeparator/>
+      </w:r>
+    </w:p>
+  </w:endnote>
+</w:endnotes>
+</file>
+
+<file path=word/footnotes.xml><?xml version="1.0" encoding="utf-8"?>
+<w:footnotes xmlns:wpc="http://schemas.microsoft.com/office/word/2010/wordprocessingCanvas" xmlns:cx="http://schemas.microsoft.com/office/drawing/2014/chartex" xmlns:cx1="http://schemas.microsoft.com/office/drawing/2015/9/8/chartex" xmlns:cx2="http://schemas.microsoft.com/office/drawing/2015/10/21/chartex" xmlns:cx3="http://schemas.microsoft.com/office/drawing/2016/5/9/chartex" xmlns:cx4="http://schemas.microsoft.com/office/drawing/2016/5/10/chartex" xmlns:cx5="http://schemas.microsoft.com/office/drawing/2016/5/11/chartex" xmlns:cx6="http://schemas.microsoft.com/office/drawing/2016/5/12/chartex" xmlns:cx7="http://schemas.microsoft.com/office/drawing/2016/5/13/chartex" xmlns:cx8="http://schemas.microsoft.com/office/drawing/2016/5/14/chartex" xmlns:mc="http://schemas.openxmlformats.org/markup-compatibility/2006" xmlns:aink="http://schemas.microsoft.com/office/drawing/2016/ink" xmlns:am3d="http://schemas.microsoft.com/office/drawing/2017/model3d" xmlns:o="urn:schemas-microsoft-com:office:office" xmlns:oel="http://schemas.microsoft.com/office/2019/extlst" xmlns:r="http://schemas.openxmlformats.org/officeDocument/2006/relationships" xmlns:m="http://schemas.openxmlformats.org/officeDocument/2006/math" xmlns:v="urn:schemas-microsoft-com:vml" xmlns:wp14="http://schemas.microsoft.com/office/word/2010/wordprocessingDrawing" xmlns:wp="http://schemas.openxmlformats.org/drawingml/2006/wordprocessingDrawing" xmlns:w10="urn:schemas-microsoft-com:office:word" xmlns:w="http://schemas.openxmlformats.org/wordprocessingml/2006/main" xmlns:w14="http://schemas.microsoft.com/office/word/2010/wordml" xmlns:w15="http://schemas.microsoft.com/office/word/2012/wordml" xmlns:w16cex="http://schemas.microsoft.com/office/word/2018/wordml/cex" xmlns:w16cid="http://schemas.microsoft.com/office/word/2016/wordml/cid" xmlns:w16="http://schemas.microsoft.com/office/word/2018/wordml" xmlns:w16du="http://schemas.microsoft.com/office/word/2023/wordml/word16du" xmlns:w16sdtdh="http://schemas.microsoft.com/office/word/2020/wordml/sdtdatahash" xmlns:w16sdtfl="http://schemas.microsoft.com/office/word/2024/wordml/sdtformatlock" xmlns:w16se="http://schemas.microsoft.com/office/word/2015/wordml/symex" xmlns:wpg="http://schemas.microsoft.com/office/word/2010/wordprocessingGroup" xmlns:wpi="http://schemas.microsoft.com/office/word/2010/wordprocessingInk" xmlns:wne="http://schemas.microsoft.com/office/word/2006/wordml" xmlns:wps="http://schemas.microsoft.com/office/word/2010/wordprocessingShape" mc:Ignorable="w14 w15 w16se w16cid w16 w16cex w16sdtdh w16sdtfl w16du wp14">
+  <w:footnote w:type="separator" w:id="-1">
+    <w:p>
+      <w:pPr>
+        <w:spacing w:after="0" w:line="240" w:lineRule="auto"/>
+      </w:pPr>
+      <w:r>
+        <w:separator/>
+      </w:r>
+    </w:p>
+  </w:footnote>
+  <w:footnote w:type="continuationSeparator" w:id="0">
+    <w:p>
+      <w:pPr>
+        <w:spacing w:after="0" w:line="240" w:lineRule="auto"/>
+      </w:pPr>
+      <w:r>
+        <w:continuationSeparator/>
+      </w:r>
+    </w:p>
+  </w:footnote>
+</w:footnotes>
 </file>
 
 <file path=word/styles.xml><?xml version="1.0" encoding="utf-8"?>
@@ -1261,6 +1718,50 @@
       <w:spacing w:val="5"/>
     </w:rPr>
   </w:style>
+  <w:style w:type="paragraph" w:styleId="Header">
+    <w:name w:val="header"/>
+    <w:basedOn w:val="Normal"/>
+    <w:link w:val="HeaderChar"/>
+    <w:uiPriority w:val="99"/>
+    <w:unhideWhenUsed/>
+    <w:rsid w:val="006719ED"/>
+    <w:pPr>
+      <w:tabs>
+        <w:tab w:val="center" w:pos="4513"/>
+        <w:tab w:val="right" w:pos="9026"/>
+      </w:tabs>
+      <w:spacing w:after="0" w:line="240" w:lineRule="auto"/>
+    </w:pPr>
+  </w:style>
+  <w:style w:type="character" w:customStyle="1" w:styleId="HeaderChar">
+    <w:name w:val="Header Char"/>
+    <w:basedOn w:val="DefaultParagraphFont"/>
+    <w:link w:val="Header"/>
+    <w:uiPriority w:val="99"/>
+    <w:rsid w:val="006719ED"/>
+  </w:style>
+  <w:style w:type="paragraph" w:styleId="Footer">
+    <w:name w:val="footer"/>
+    <w:basedOn w:val="Normal"/>
+    <w:link w:val="FooterChar"/>
+    <w:uiPriority w:val="99"/>
+    <w:unhideWhenUsed/>
+    <w:rsid w:val="006719ED"/>
+    <w:pPr>
+      <w:tabs>
+        <w:tab w:val="center" w:pos="4513"/>
+        <w:tab w:val="right" w:pos="9026"/>
+      </w:tabs>
+      <w:spacing w:after="0" w:line="240" w:lineRule="auto"/>
+    </w:pPr>
+  </w:style>
+  <w:style w:type="character" w:customStyle="1" w:styleId="FooterChar">
+    <w:name w:val="Footer Char"/>
+    <w:basedOn w:val="DefaultParagraphFont"/>
+    <w:link w:val="Footer"/>
+    <w:uiPriority w:val="99"/>
+    <w:rsid w:val="006719ED"/>
+  </w:style>
 </w:styles>
 </file>
 

</xml_diff>